<commit_message>
some minor information added
</commit_message>
<xml_diff>
--- a/Group11_Report.docx
+++ b/Group11_Report.docx
@@ -29,40 +29,8 @@
           <w:sz w:val="52"/>
           <w:szCs w:val="52"/>
         </w:rPr>
-        <w:t xml:space="preserve">Privacy-Preserving </w:t>
-      </w:r>
-      <w:proofErr w:type="gramStart"/>
-      <w:r>
-        <w:rPr>
-          <w:b/>
-          <w:bCs/>
-          <w:color w:val="1F3864" w:themeColor="accent1" w:themeShade="80"/>
-          <w:sz w:val="52"/>
-          <w:szCs w:val="52"/>
-        </w:rPr>
-        <w:t xml:space="preserve">Authentication </w:t>
-      </w:r>
-      <w:r>
-        <w:rPr>
-          <w:b/>
-          <w:bCs/>
-          <w:color w:val="1F3864" w:themeColor="accent1" w:themeShade="80"/>
-          <w:sz w:val="52"/>
-          <w:szCs w:val="52"/>
-        </w:rPr>
-        <w:t xml:space="preserve"> </w:t>
-      </w:r>
-      <w:r>
-        <w:rPr>
-          <w:b/>
-          <w:bCs/>
-          <w:color w:val="1F3864" w:themeColor="accent1" w:themeShade="80"/>
-          <w:sz w:val="52"/>
-          <w:szCs w:val="52"/>
-        </w:rPr>
-        <w:t>System</w:t>
-      </w:r>
-      <w:proofErr w:type="gramEnd"/>
+        <w:t>Anonymous Voting System</w:t>
+      </w:r>
     </w:p>
     <w:p>
       <w:pPr>
@@ -855,6 +823,14 @@
         </w:rPr>
         <w:t xml:space="preserve">GitHub: </w:t>
       </w:r>
+      <w:hyperlink r:id="rId7" w:history="1">
+        <w:r>
+          <w:rPr>
+            <w:rStyle w:val="Hyperlink"/>
+          </w:rPr>
+          <w:t>REPO LINK</w:t>
+        </w:r>
+      </w:hyperlink>
     </w:p>
     <w:p>
       <w:r>
@@ -1143,6 +1119,79 @@
     </w:p>
     <w:p>
       <w:pPr>
+        <w:pStyle w:val="ListParagraph"/>
+        <w:numPr>
+          <w:ilvl w:val="0"/>
+          <w:numId w:val="2"/>
+        </w:numPr>
+        <w:spacing w:before="60" w:after="60"/>
+      </w:pPr>
+      <w:r>
+        <w:t>Intigrity – Even someone will intercept and change value we are checking before accept</w:t>
+      </w:r>
+      <w:r>
+        <w:br/>
+        <w:t xml:space="preserve">                What it </w:t>
+      </w:r>
+      <w:proofErr w:type="gramStart"/>
+      <w:r>
+        <w:t>mean</w:t>
+      </w:r>
+      <w:proofErr w:type="gramEnd"/>
+      <w:r>
+        <w:t xml:space="preserve"> is (vote, </w:t>
+      </w:r>
+      <w:proofErr w:type="spellStart"/>
+      <w:r>
+        <w:t>unblindSignVote</w:t>
+      </w:r>
+      <w:proofErr w:type="spellEnd"/>
+      <w:r>
+        <w:t xml:space="preserve">) then even someone </w:t>
+      </w:r>
+      <w:proofErr w:type="spellStart"/>
+      <w:r>
+        <w:t>chande</w:t>
+      </w:r>
+      <w:proofErr w:type="spellEnd"/>
+      <w:r>
+        <w:t xml:space="preserve"> to vote to </w:t>
+      </w:r>
+      <w:r>
+        <w:br/>
+        <w:t xml:space="preserve">                vote’ but </w:t>
+      </w:r>
+      <w:proofErr w:type="spellStart"/>
+      <w:proofErr w:type="gramStart"/>
+      <w:r>
+        <w:t>cant</w:t>
+      </w:r>
+      <w:proofErr w:type="spellEnd"/>
+      <w:proofErr w:type="gramEnd"/>
+      <w:r>
+        <w:t xml:space="preserve"> change the </w:t>
+      </w:r>
+      <w:proofErr w:type="spellStart"/>
+      <w:r>
+        <w:t>unblindSignVote</w:t>
+      </w:r>
+      <w:proofErr w:type="spellEnd"/>
+    </w:p>
+    <w:p>
+      <w:pPr>
+        <w:pStyle w:val="ListParagraph"/>
+        <w:numPr>
+          <w:ilvl w:val="0"/>
+          <w:numId w:val="2"/>
+        </w:numPr>
+        <w:spacing w:before="60" w:after="60"/>
+      </w:pPr>
+      <w:r>
+        <w:t>Confidentiality – No can see what is actual vote/messages we are blinding messages.</w:t>
+      </w:r>
+    </w:p>
+    <w:p>
+      <w:pPr>
         <w:pStyle w:val="Heading1"/>
         <w:pBdr>
           <w:bottom w:val="single" w:sz="6" w:space="1" w:color="2E74B5"/>
@@ -1157,6 +1206,7 @@
         <w:pStyle w:val="Heading2"/>
       </w:pPr>
       <w:r>
+        <w:lastRenderedPageBreak/>
         <w:t>3.1 Blind Signatures</w:t>
       </w:r>
     </w:p>
@@ -1166,7 +1216,6 @@
         <w:jc w:val="both"/>
       </w:pPr>
       <w:r>
-        <w:lastRenderedPageBreak/>
         <w:t>Blind signatures were invented by David Chaum in 1982 and are the foundation of anonymous authentication systems. The idea is simple: a signer signs a message without ever seeing its content.</w:t>
       </w:r>
     </w:p>
@@ -1986,6 +2035,7 @@
         <w:jc w:val="both"/>
       </w:pPr>
       <w:r>
+        <w:lastRenderedPageBreak/>
         <w:t>Key generation is a critical security boundary. The corrected design assigns key ownership as follows:</w:t>
       </w:r>
     </w:p>
@@ -3999,6 +4049,7 @@
         <w:jc w:val="both"/>
       </w:pPr>
       <w:r>
+        <w:lastRenderedPageBreak/>
         <w:t xml:space="preserve">The Verification Authority reads </w:t>
       </w:r>
       <w:proofErr w:type="spellStart"/>
@@ -4060,7 +4111,6 @@
         <w:pStyle w:val="Heading2"/>
       </w:pPr>
       <w:r>
-        <w:lastRenderedPageBreak/>
         <w:t>Phase 2 - Client Key Generation</w:t>
       </w:r>
     </w:p>
@@ -5758,7 +5808,6 @@
         <w:pStyle w:val="Heading2"/>
       </w:pPr>
       <w:r>
-        <w:lastRenderedPageBreak/>
         <w:t>Phase 6 - Unblinding (Client Side)</w:t>
       </w:r>
     </w:p>
@@ -6896,7 +6945,6 @@
           <w:b/>
           <w:bCs/>
         </w:rPr>
-        <w:lastRenderedPageBreak/>
         <w:t xml:space="preserve">Identity </w:t>
       </w:r>
       <w:proofErr w:type="spellStart"/>
@@ -7363,8 +7411,8 @@
       </w:r>
     </w:p>
     <w:sectPr>
-      <w:headerReference w:type="default" r:id="rId7"/>
-      <w:footerReference w:type="default" r:id="rId8"/>
+      <w:headerReference w:type="default" r:id="rId8"/>
+      <w:footerReference w:type="default" r:id="rId9"/>
       <w:pgSz w:w="12240" w:h="15840"/>
       <w:pgMar w:top="1440" w:right="1440" w:bottom="1440" w:left="1440" w:header="708" w:footer="708" w:gutter="0"/>
       <w:cols w:space="720"/>
@@ -8401,6 +8449,18 @@
     <w:semiHidden/>
     <w:rsid w:val="00317D5E"/>
   </w:style>
+  <w:style w:type="character" w:styleId="UnresolvedMention">
+    <w:name w:val="Unresolved Mention"/>
+    <w:basedOn w:val="DefaultParagraphFont"/>
+    <w:uiPriority w:val="99"/>
+    <w:semiHidden/>
+    <w:unhideWhenUsed/>
+    <w:rsid w:val="0036696F"/>
+    <w:rPr>
+      <w:color w:val="605E5C"/>
+      <w:shd w:val="clear" w:color="auto" w:fill="E1DFDD"/>
+    </w:rPr>
+  </w:style>
 </w:styles>
 </file>
 

</xml_diff>